<commit_message>
Add the CIA-3 technical report on the course template, with its generator
scripts/build_report.py fills the course template from the measured results
(comparison summary, dashboard export, training logs) and regenerates the
seven figures, so the report stays consistent with whatever run produced
them; scripts/benchmark_compute.py supplies the measured computational-cost
table. Also points the Kaggle download helper at the correct dataset slug.

Co-Authored-By: Claude Opus 5 <noreply@anthropic.com>
</commit_message>
<xml_diff>
--- a/report/RL_CIA3_Technical_Report.docx
+++ b/report/RL_CIA3_Technical_Report.docx
@@ -1851,7 +1851,20 @@
           <w:rFonts w:ascii="Consolas" w:hAnsi="Consolas"/>
           <w:sz w:val="20"/>
         </w:rPr>
-        <w:t>RCR(t) = revenue(t) / traffic(t),      DRCR(t) = RCR(t) − RCR(t − 1),      r(t) = 100 × DRCR(t)</w:t>
+        <w:t>RCR(t) = revenue(t) / traffic(t),        DRCR(t) = RCR(t) − RCR(t − 1)</w:t>
+      </w:r>
+    </w:p>
+    <w:p>
+      <w:pPr>
+        <w:spacing w:after="120"/>
+        <w:jc w:val="center"/>
+      </w:pPr>
+      <w:r>
+        <w:rPr>
+          <w:rFonts w:ascii="Consolas" w:hAnsi="Consolas"/>
+          <w:sz w:val="20"/>
+        </w:rPr>
+        <w:t>r(t) = 100 × DRCR(t)</w:t>
       </w:r>
     </w:p>
     <w:p>

</xml_diff>